<commit_message>
Document verified GPU runner and final teacher status
</commit_message>
<xml_diff>
--- a/results/ACTIVITY_REPORT.docx
+++ b/results/ACTIVITY_REPORT.docx
@@ -5464,6 +5464,100 @@
           </w:p>
         </w:tc>
       </w:tr>
+      <w:tr>
+        <w:tc>
+          <w:tcPr>
+            <w:tcW w:type="dxa" w:w="1900"/>
+            <w:vAlign w:val="center"/>
+            <w:shd w:fill="F8FAFC"/>
+          </w:tcPr>
+          <w:p>
+            <w:pPr>
+              <w:jc w:val="right"/>
+              <w:bidi w:val="1"/>
+            </w:pPr>
+            <w:r/>
+            <w:r>
+              <w:rPr>
+                <w:rFonts w:ascii="Calibri" w:hAnsi="Calibri" w:cs="Tahoma"/>
+                <w:b w:val="0"/>
+                <w:color w:val="000000"/>
+                <w:sz w:val="17"/>
+              </w:rPr>
+              <w:t>Official XResNet1D101</w:t>
+            </w:r>
+          </w:p>
+        </w:tc>
+        <w:tc>
+          <w:tcPr>
+            <w:tcW w:type="dxa" w:w="2486"/>
+            <w:vAlign w:val="center"/>
+            <w:shd w:fill="F8FAFC"/>
+          </w:tcPr>
+          <w:p>
+            <w:pPr>
+              <w:jc w:val="right"/>
+              <w:bidi w:val="1"/>
+            </w:pPr>
+            <w:r/>
+            <w:r>
+              <w:rPr>
+                <w:rFonts w:ascii="Calibri" w:hAnsi="Calibri" w:cs="Tahoma"/>
+                <w:b w:val="0"/>
+                <w:color w:val="000000"/>
+                <w:sz w:val="17"/>
+              </w:rPr>
+              <w:t>85.158%</w:t>
+            </w:r>
+          </w:p>
+        </w:tc>
+        <w:tc>
+          <w:tcPr>
+            <w:tcW w:type="dxa" w:w="2487"/>
+            <w:vAlign w:val="center"/>
+            <w:shd w:fill="F8FAFC"/>
+          </w:tcPr>
+          <w:p>
+            <w:pPr>
+              <w:jc w:val="right"/>
+              <w:bidi w:val="1"/>
+            </w:pPr>
+            <w:r/>
+            <w:r>
+              <w:rPr>
+                <w:rFonts w:ascii="Calibri" w:hAnsi="Calibri" w:cs="Tahoma"/>
+                <w:b w:val="0"/>
+                <w:color w:val="000000"/>
+                <w:sz w:val="17"/>
+              </w:rPr>
+              <w:t>91.165%</w:t>
+            </w:r>
+          </w:p>
+        </w:tc>
+        <w:tc>
+          <w:tcPr>
+            <w:tcW w:type="dxa" w:w="2487"/>
+            <w:vAlign w:val="center"/>
+            <w:shd w:fill="F8FAFC"/>
+          </w:tcPr>
+          <w:p>
+            <w:pPr>
+              <w:jc w:val="right"/>
+              <w:bidi w:val="1"/>
+            </w:pPr>
+            <w:r/>
+            <w:r>
+              <w:rPr>
+                <w:rFonts w:ascii="Calibri" w:hAnsi="Calibri" w:cs="Tahoma"/>
+                <w:b w:val="0"/>
+                <w:color w:val="000000"/>
+                <w:sz w:val="17"/>
+              </w:rPr>
+              <w:t>تکمیل با early stopping؛ ضعیف‌تر از ensemble</w:t>
+            </w:r>
+          </w:p>
+        </w:tc>
+      </w:tr>
     </w:tbl>
     <w:p>
       <w:pPr>
@@ -5580,6 +5674,22 @@
           <w:sz w:val="21"/>
         </w:rPr>
         <w:t>گزارش Teacher سریع: C:\ptbxl\results\teacher_fast_100hz\report.json</w:t>
+      </w:r>
+    </w:p>
+    <w:p>
+      <w:pPr>
+        <w:pStyle w:val="ListBullet"/>
+        <w:jc w:val="right"/>
+        <w:bidi w:val="1"/>
+      </w:pPr>
+      <w:r>
+        <w:rPr>
+          <w:rFonts w:ascii="Calibri" w:hAnsi="Calibri" w:cs="Tahoma"/>
+          <w:b w:val="0"/>
+          <w:color w:val="000000"/>
+          <w:sz w:val="21"/>
+        </w:rPr>
+        <w:t>گزارش XResNet رسمی: C:\ptbxl\results\teacher_official_xresnet101\report.json</w:t>
       </w:r>
     </w:p>
     <w:p>
@@ -5882,6 +5992,574 @@
           <w:sz w:val="21"/>
         </w:rPr>
         <w:t>پروژه از Teacher اولیه 87.357 درصد به بهترین Validation Accuracy برابر 87.769 درصد رسید. این افزایش با TTA، fine-tune و ensemble حاصل شد، اما هدف 90 درصد هنوز محقق نشده است. آزمایش سریع 100Hz نشان داد کاهش محاسبات لزوماً به دقت بهتر منجر نمی‌شود. ادامه منطقی، استفاده از backbone رسمی و قوی‌تر PTB-XL است؛ Test همچنان مهروموم باقی می‌ماند تا اعتبار روش‌شناسی حفظ شود.</w:t>
+      </w:r>
+    </w:p>
+    <w:p>
+      <w:pPr>
+        <w:pStyle w:val="Heading2"/>
+        <w:jc w:val="right"/>
+        <w:bidi w:val="1"/>
+      </w:pPr>
+      <w:r>
+        <w:rPr>
+          <w:rFonts w:ascii="Calibri" w:hAnsi="Calibri" w:cs="Tahoma"/>
+          <w:b/>
+          <w:color w:val="2E74B5"/>
+          <w:sz w:val="26"/>
+        </w:rPr>
+        <w:t>13. اجرای Official XResNet1D101</w:t>
+      </w:r>
+    </w:p>
+    <w:p>
+      <w:pPr>
+        <w:jc w:val="right"/>
+        <w:bidi w:val="1"/>
+      </w:pPr>
+      <w:r>
+        <w:rPr>
+          <w:rFonts w:ascii="Calibri" w:hAnsi="Calibri" w:cs="Tahoma"/>
+          <w:b w:val="0"/>
+          <w:color w:val="000000"/>
+          <w:sz w:val="21"/>
+        </w:rPr>
+        <w:t>برای آزمودن پیشنهاد backbone رسمی، معماری xresnet1d101 با خروجی دودویی و همان تعریف برچسب و split قبلی اجرا شد. آموزش برای حداکثر 20 epoch برنامه‌ریزی شده بود و پس از شش epoch بدون بهبود، در پایان epoch 13 به‌طور سالم با early stopping خاتمه یافت.</w:t>
+      </w:r>
+    </w:p>
+    <w:tbl>
+      <w:tblPr>
+        <w:tblStyle w:val="TableGrid"/>
+        <w:tblW w:type="dxa" w:w="9360"/>
+        <w:jc w:val="center"/>
+        <w:tblLayout w:type="fixed"/>
+        <w:tblLook w:firstColumn="1" w:firstRow="1" w:lastColumn="0" w:lastRow="0" w:noHBand="0" w:noVBand="1" w:val="04A0"/>
+        <w:tblInd w:w="120" w:type="dxa"/>
+      </w:tblPr>
+      <w:tblGrid>
+        <w:gridCol w:w="2700"/>
+        <w:gridCol w:w="6660"/>
+      </w:tblGrid>
+      <w:tr>
+        <w:tc>
+          <w:tcPr>
+            <w:tcW w:type="dxa" w:w="2700"/>
+            <w:vAlign w:val="center"/>
+            <w:shd w:fill="E8EEF5"/>
+          </w:tcPr>
+          <w:p>
+            <w:pPr>
+              <w:jc w:val="right"/>
+              <w:bidi w:val="1"/>
+            </w:pPr>
+            <w:r/>
+            <w:r>
+              <w:rPr>
+                <w:rFonts w:ascii="Calibri" w:hAnsi="Calibri" w:cs="Tahoma"/>
+                <w:b/>
+                <w:color w:val="1F4D78"/>
+                <w:sz w:val="17"/>
+              </w:rPr>
+              <w:t>مشخصه</w:t>
+            </w:r>
+          </w:p>
+        </w:tc>
+        <w:tc>
+          <w:tcPr>
+            <w:tcW w:type="dxa" w:w="6660"/>
+            <w:vAlign w:val="center"/>
+            <w:shd w:fill="E8EEF5"/>
+          </w:tcPr>
+          <w:p>
+            <w:pPr>
+              <w:jc w:val="right"/>
+              <w:bidi w:val="1"/>
+            </w:pPr>
+            <w:r/>
+            <w:r>
+              <w:rPr>
+                <w:rFonts w:ascii="Calibri" w:hAnsi="Calibri" w:cs="Tahoma"/>
+                <w:b/>
+                <w:color w:val="1F4D78"/>
+                <w:sz w:val="17"/>
+              </w:rPr>
+              <w:t>مقدار</w:t>
+            </w:r>
+          </w:p>
+        </w:tc>
+        <w:trPr>
+          <w:tblHeader/>
+        </w:trPr>
+      </w:tr>
+      <w:tr>
+        <w:tc>
+          <w:tcPr>
+            <w:tcW w:type="dxa" w:w="2700"/>
+            <w:vAlign w:val="center"/>
+          </w:tcPr>
+          <w:p>
+            <w:pPr>
+              <w:jc w:val="right"/>
+              <w:bidi w:val="1"/>
+            </w:pPr>
+            <w:r/>
+            <w:r>
+              <w:rPr>
+                <w:rFonts w:ascii="Calibri" w:hAnsi="Calibri" w:cs="Tahoma"/>
+                <w:b w:val="0"/>
+                <w:color w:val="000000"/>
+                <w:sz w:val="17"/>
+              </w:rPr>
+              <w:t>بهترین epoch</w:t>
+            </w:r>
+          </w:p>
+        </w:tc>
+        <w:tc>
+          <w:tcPr>
+            <w:tcW w:type="dxa" w:w="6660"/>
+            <w:vAlign w:val="center"/>
+          </w:tcPr>
+          <w:p>
+            <w:pPr>
+              <w:jc w:val="right"/>
+              <w:bidi w:val="1"/>
+            </w:pPr>
+            <w:r/>
+            <w:r>
+              <w:rPr>
+                <w:rFonts w:ascii="Calibri" w:hAnsi="Calibri" w:cs="Tahoma"/>
+                <w:b w:val="0"/>
+                <w:color w:val="000000"/>
+                <w:sz w:val="17"/>
+              </w:rPr>
+              <w:t>7</w:t>
+            </w:r>
+          </w:p>
+        </w:tc>
+      </w:tr>
+      <w:tr>
+        <w:tc>
+          <w:tcPr>
+            <w:tcW w:type="dxa" w:w="2700"/>
+            <w:vAlign w:val="center"/>
+            <w:shd w:fill="F8FAFC"/>
+          </w:tcPr>
+          <w:p>
+            <w:pPr>
+              <w:jc w:val="right"/>
+              <w:bidi w:val="1"/>
+            </w:pPr>
+            <w:r/>
+            <w:r>
+              <w:rPr>
+                <w:rFonts w:ascii="Calibri" w:hAnsi="Calibri" w:cs="Tahoma"/>
+                <w:b w:val="0"/>
+                <w:color w:val="000000"/>
+                <w:sz w:val="17"/>
+              </w:rPr>
+              <w:t>Accuracy</w:t>
+            </w:r>
+          </w:p>
+        </w:tc>
+        <w:tc>
+          <w:tcPr>
+            <w:tcW w:type="dxa" w:w="6660"/>
+            <w:vAlign w:val="center"/>
+            <w:shd w:fill="F8FAFC"/>
+          </w:tcPr>
+          <w:p>
+            <w:pPr>
+              <w:jc w:val="right"/>
+              <w:bidi w:val="1"/>
+            </w:pPr>
+            <w:r/>
+            <w:r>
+              <w:rPr>
+                <w:rFonts w:ascii="Calibri" w:hAnsi="Calibri" w:cs="Tahoma"/>
+                <w:b w:val="0"/>
+                <w:color w:val="000000"/>
+                <w:sz w:val="17"/>
+              </w:rPr>
+              <w:t>85.158%</w:t>
+            </w:r>
+          </w:p>
+        </w:tc>
+      </w:tr>
+      <w:tr>
+        <w:tc>
+          <w:tcPr>
+            <w:tcW w:type="dxa" w:w="2700"/>
+            <w:vAlign w:val="center"/>
+          </w:tcPr>
+          <w:p>
+            <w:pPr>
+              <w:jc w:val="right"/>
+              <w:bidi w:val="1"/>
+            </w:pPr>
+            <w:r/>
+            <w:r>
+              <w:rPr>
+                <w:rFonts w:ascii="Calibri" w:hAnsi="Calibri" w:cs="Tahoma"/>
+                <w:b w:val="0"/>
+                <w:color w:val="000000"/>
+                <w:sz w:val="17"/>
+              </w:rPr>
+              <w:t>Sensitivity</w:t>
+            </w:r>
+          </w:p>
+        </w:tc>
+        <w:tc>
+          <w:tcPr>
+            <w:tcW w:type="dxa" w:w="6660"/>
+            <w:vAlign w:val="center"/>
+          </w:tcPr>
+          <w:p>
+            <w:pPr>
+              <w:jc w:val="right"/>
+              <w:bidi w:val="1"/>
+            </w:pPr>
+            <w:r/>
+            <w:r>
+              <w:rPr>
+                <w:rFonts w:ascii="Calibri" w:hAnsi="Calibri" w:cs="Tahoma"/>
+                <w:b w:val="0"/>
+                <w:color w:val="000000"/>
+                <w:sz w:val="17"/>
+              </w:rPr>
+              <w:t>73.529%</w:t>
+            </w:r>
+          </w:p>
+        </w:tc>
+      </w:tr>
+      <w:tr>
+        <w:tc>
+          <w:tcPr>
+            <w:tcW w:type="dxa" w:w="2700"/>
+            <w:vAlign w:val="center"/>
+            <w:shd w:fill="F8FAFC"/>
+          </w:tcPr>
+          <w:p>
+            <w:pPr>
+              <w:jc w:val="right"/>
+              <w:bidi w:val="1"/>
+            </w:pPr>
+            <w:r/>
+            <w:r>
+              <w:rPr>
+                <w:rFonts w:ascii="Calibri" w:hAnsi="Calibri" w:cs="Tahoma"/>
+                <w:b w:val="0"/>
+                <w:color w:val="000000"/>
+                <w:sz w:val="17"/>
+              </w:rPr>
+              <w:t>Specificity</w:t>
+            </w:r>
+          </w:p>
+        </w:tc>
+        <w:tc>
+          <w:tcPr>
+            <w:tcW w:type="dxa" w:w="6660"/>
+            <w:vAlign w:val="center"/>
+            <w:shd w:fill="F8FAFC"/>
+          </w:tcPr>
+          <w:p>
+            <w:pPr>
+              <w:jc w:val="right"/>
+              <w:bidi w:val="1"/>
+            </w:pPr>
+            <w:r/>
+            <w:r>
+              <w:rPr>
+                <w:rFonts w:ascii="Calibri" w:hAnsi="Calibri" w:cs="Tahoma"/>
+                <w:b w:val="0"/>
+                <w:color w:val="000000"/>
+                <w:sz w:val="17"/>
+              </w:rPr>
+              <w:t>90.419%</w:t>
+            </w:r>
+          </w:p>
+        </w:tc>
+      </w:tr>
+      <w:tr>
+        <w:tc>
+          <w:tcPr>
+            <w:tcW w:type="dxa" w:w="2700"/>
+            <w:vAlign w:val="center"/>
+          </w:tcPr>
+          <w:p>
+            <w:pPr>
+              <w:jc w:val="right"/>
+              <w:bidi w:val="1"/>
+            </w:pPr>
+            <w:r/>
+            <w:r>
+              <w:rPr>
+                <w:rFonts w:ascii="Calibri" w:hAnsi="Calibri" w:cs="Tahoma"/>
+                <w:b w:val="0"/>
+                <w:color w:val="000000"/>
+                <w:sz w:val="17"/>
+              </w:rPr>
+              <w:t>F1</w:t>
+            </w:r>
+          </w:p>
+        </w:tc>
+        <w:tc>
+          <w:tcPr>
+            <w:tcW w:type="dxa" w:w="6660"/>
+            <w:vAlign w:val="center"/>
+          </w:tcPr>
+          <w:p>
+            <w:pPr>
+              <w:jc w:val="right"/>
+              <w:bidi w:val="1"/>
+            </w:pPr>
+            <w:r/>
+            <w:r>
+              <w:rPr>
+                <w:rFonts w:ascii="Calibri" w:hAnsi="Calibri" w:cs="Tahoma"/>
+                <w:b w:val="0"/>
+                <w:color w:val="000000"/>
+                <w:sz w:val="17"/>
+              </w:rPr>
+              <w:t>75.529%</w:t>
+            </w:r>
+          </w:p>
+        </w:tc>
+      </w:tr>
+      <w:tr>
+        <w:tc>
+          <w:tcPr>
+            <w:tcW w:type="dxa" w:w="2700"/>
+            <w:vAlign w:val="center"/>
+            <w:shd w:fill="F8FAFC"/>
+          </w:tcPr>
+          <w:p>
+            <w:pPr>
+              <w:jc w:val="right"/>
+              <w:bidi w:val="1"/>
+            </w:pPr>
+            <w:r/>
+            <w:r>
+              <w:rPr>
+                <w:rFonts w:ascii="Calibri" w:hAnsi="Calibri" w:cs="Tahoma"/>
+                <w:b w:val="0"/>
+                <w:color w:val="000000"/>
+                <w:sz w:val="17"/>
+              </w:rPr>
+              <w:t>AUC</w:t>
+            </w:r>
+          </w:p>
+        </w:tc>
+        <w:tc>
+          <w:tcPr>
+            <w:tcW w:type="dxa" w:w="6660"/>
+            <w:vAlign w:val="center"/>
+            <w:shd w:fill="F8FAFC"/>
+          </w:tcPr>
+          <w:p>
+            <w:pPr>
+              <w:jc w:val="right"/>
+              <w:bidi w:val="1"/>
+            </w:pPr>
+            <w:r/>
+            <w:r>
+              <w:rPr>
+                <w:rFonts w:ascii="Calibri" w:hAnsi="Calibri" w:cs="Tahoma"/>
+                <w:b w:val="0"/>
+                <w:color w:val="000000"/>
+                <w:sz w:val="17"/>
+              </w:rPr>
+              <w:t>91.165%</w:t>
+            </w:r>
+          </w:p>
+        </w:tc>
+      </w:tr>
+      <w:tr>
+        <w:tc>
+          <w:tcPr>
+            <w:tcW w:type="dxa" w:w="2700"/>
+            <w:vAlign w:val="center"/>
+          </w:tcPr>
+          <w:p>
+            <w:pPr>
+              <w:jc w:val="right"/>
+              <w:bidi w:val="1"/>
+            </w:pPr>
+            <w:r/>
+            <w:r>
+              <w:rPr>
+                <w:rFonts w:ascii="Calibri" w:hAnsi="Calibri" w:cs="Tahoma"/>
+                <w:b w:val="0"/>
+                <w:color w:val="000000"/>
+                <w:sz w:val="17"/>
+              </w:rPr>
+              <w:t>Threshold</w:t>
+            </w:r>
+          </w:p>
+        </w:tc>
+        <w:tc>
+          <w:tcPr>
+            <w:tcW w:type="dxa" w:w="6660"/>
+            <w:vAlign w:val="center"/>
+          </w:tcPr>
+          <w:p>
+            <w:pPr>
+              <w:jc w:val="right"/>
+              <w:bidi w:val="1"/>
+            </w:pPr>
+            <w:r/>
+            <w:r>
+              <w:rPr>
+                <w:rFonts w:ascii="Calibri" w:hAnsi="Calibri" w:cs="Tahoma"/>
+                <w:b w:val="0"/>
+                <w:color w:val="000000"/>
+                <w:sz w:val="17"/>
+              </w:rPr>
+              <w:t>0.494</w:t>
+            </w:r>
+          </w:p>
+        </w:tc>
+      </w:tr>
+      <w:tr>
+        <w:tc>
+          <w:tcPr>
+            <w:tcW w:type="dxa" w:w="2700"/>
+            <w:vAlign w:val="center"/>
+            <w:shd w:fill="F8FAFC"/>
+          </w:tcPr>
+          <w:p>
+            <w:pPr>
+              <w:jc w:val="right"/>
+              <w:bidi w:val="1"/>
+            </w:pPr>
+            <w:r/>
+            <w:r>
+              <w:rPr>
+                <w:rFonts w:ascii="Calibri" w:hAnsi="Calibri" w:cs="Tahoma"/>
+                <w:b w:val="0"/>
+                <w:color w:val="000000"/>
+                <w:sz w:val="17"/>
+              </w:rPr>
+              <w:t>ماتریس اغتشاش</w:t>
+            </w:r>
+          </w:p>
+        </w:tc>
+        <w:tc>
+          <w:tcPr>
+            <w:tcW w:type="dxa" w:w="6660"/>
+            <w:vAlign w:val="center"/>
+            <w:shd w:fill="F8FAFC"/>
+          </w:tcPr>
+          <w:p>
+            <w:pPr>
+              <w:jc w:val="right"/>
+              <w:bidi w:val="1"/>
+            </w:pPr>
+            <w:r/>
+            <w:r>
+              <w:rPr>
+                <w:rFonts w:ascii="Calibri" w:hAnsi="Calibri" w:cs="Tahoma"/>
+                <w:b w:val="0"/>
+                <w:color w:val="000000"/>
+                <w:sz w:val="17"/>
+              </w:rPr>
+              <w:t>TP=500، FN=180، TN=1359، FP=144</w:t>
+            </w:r>
+          </w:p>
+        </w:tc>
+      </w:tr>
+    </w:tbl>
+    <w:p>
+      <w:pPr>
+        <w:spacing w:after="40"/>
+      </w:pPr>
+    </w:p>
+    <w:p>
+      <w:pPr>
+        <w:jc w:val="right"/>
+        <w:bidi w:val="1"/>
+      </w:pPr>
+      <w:r>
+        <w:rPr>
+          <w:rFonts w:ascii="Calibri" w:hAnsi="Calibri" w:cs="Tahoma"/>
+          <w:b w:val="0"/>
+          <w:color w:val="000000"/>
+          <w:sz w:val="21"/>
+        </w:rPr>
+        <w:t>epoch 13 با Accuracy برابر 84.563 درصد و AUC برابر 90.988 درصد پایان یافت. کاهش loss آموزش همراه با عدم بهبود پایدار Validation نشانه اشباع/بیش‌برازش بود. بنابراین checkpoint epoch 7 نگه داشته شد، هدف 90 درصد محقق نشد و ensemble قبلی همچنان بهترین انتخاب است. مجموعه Test در این اجرا نیز دست‌نخورده ماند.</w:t>
+      </w:r>
+    </w:p>
+    <w:p>
+      <w:pPr>
+        <w:pStyle w:val="Heading2"/>
+        <w:jc w:val="right"/>
+        <w:bidi w:val="1"/>
+      </w:pPr>
+      <w:r>
+        <w:rPr>
+          <w:rFonts w:ascii="Calibri" w:hAnsi="Calibri" w:cs="Tahoma"/>
+          <w:b/>
+          <w:color w:val="2E74B5"/>
+          <w:sz w:val="26"/>
+        </w:rPr>
+        <w:t>14. زیرساخت GitHub و اثبات GPU رانر محلی</w:t>
+      </w:r>
+    </w:p>
+    <w:p>
+      <w:pPr>
+        <w:jc w:val="right"/>
+        <w:bidi w:val="1"/>
+      </w:pPr>
+      <w:r>
+        <w:rPr>
+          <w:rFonts w:ascii="Calibri" w:hAnsi="Calibri" w:cs="Tahoma"/>
+          <w:b w:val="0"/>
+          <w:color w:val="000000"/>
+          <w:sz w:val="21"/>
+        </w:rPr>
+        <w:t>مخزن عمومی پروژه فقط شامل کد، مستندات و نتایج سبک است؛ دیتاست، checkpoint، محیط مجازی و فایل‌های رانر از Git مستثنا هستند. رانر self-hosted ویندوز با برچسب ptbxl-local ثبت شده و workflowهای آن عمداً فقط با اجرای دستی فعال می‌شوند تا pull request عمومی نتواند روی لپ‌تاپ کد اجرا کند.</w:t>
+      </w:r>
+    </w:p>
+    <w:p>
+      <w:pPr>
+        <w:jc w:val="right"/>
+        <w:bidi w:val="1"/>
+      </w:pPr>
+      <w:r>
+        <w:rPr>
+          <w:rFonts w:ascii="Calibri" w:hAnsi="Calibri" w:cs="Tahoma"/>
+          <w:b w:val="0"/>
+          <w:color w:val="000000"/>
+          <w:sz w:val="21"/>
+        </w:rPr>
+        <w:t>فایل runner_gpu_probe.py یک بار کاری محدود CUDA اجرا می‌کند، نام GPU و نسخه CUDA/PyTorch، تعداد ضرب ماتریسی، زمان اجرا، checksum و شناسه‌های GitHub را در JSON ثبت می‌کند. workflow با نام GPU Runner Proof خلاصه و JSON کامل را در log صفحه Action نشان می‌دهد و نسخه ماشین‌خوان آن در results/GPU_RUNNER_PROOF.json بایگانی می‌شود.</w:t>
+      </w:r>
+    </w:p>
+    <w:p>
+      <w:pPr>
+        <w:jc w:val="right"/>
+        <w:bidi w:val="1"/>
+      </w:pPr>
+      <w:r>
+        <w:rPr>
+          <w:rFonts w:ascii="Calibri" w:hAnsi="Calibri" w:cs="Tahoma"/>
+          <w:b w:val="0"/>
+          <w:color w:val="000000"/>
+          <w:sz w:val="21"/>
+        </w:rPr>
+        <w:t>اجرای end-to-end شماره 32453602059 روی commit a403ead موفق شد: GitHub کد را checkout کرد، رانر LAPTOP-ptbxl-2 کارت Quadro P1000 را با PyTorch 2.3.1 و CUDA 12.1 فعال کرد، 10,081 ضرب ماتریس 1024×1024 را در 16.688 ثانیه انجام داد و JSON را اعتبارسنجی کرد. تمام مراحل job در 59 ثانیه سبز شدند. پیوند عمومی: https://github.com/alimirzae/ptbxl-teacher-kd/actions/runs/32453602059.</w:t>
+      </w:r>
+    </w:p>
+    <w:p>
+      <w:pPr>
+        <w:jc w:val="right"/>
+        <w:bidi w:val="1"/>
+      </w:pPr>
+      <w:r>
+        <w:rPr>
+          <w:rFonts w:ascii="Calibri" w:hAnsi="Calibri" w:cs="Tahoma"/>
+          <w:b w:val="0"/>
+          <w:color w:val="000000"/>
+          <w:sz w:val="21"/>
+        </w:rPr>
+        <w:t>در اجرای نخست، مرحله محاسبات GPU موفق بود اما upload-artifact@v4 به‌علت مشکل شبکه در انتقال فایل 894 بایتی متوقف ماند و session رانر را busy نگه داشت. job به‌صورت force-cancel خاتمه یافت، یک ثبت runner مستقل ساخته شد و workflow طوری اصلاح شد که JSON را مستقیماً در log/summary منتشر و در مخزن بایگانی کند. ثبت قدیمی حذف شد و تنها رانر سالم آنلاین باقی ماند. این رخداد نشان داد مسیر رفت و اجرای GPU صحیح است و وابستگی artifact در شبکه فعلی قابل اتکا نیست.</w:t>
       </w:r>
     </w:p>
     <w:sectPr>

</xml_diff>